<commit_message>
complete disaster support app
</commit_message>
<xml_diff>
--- a/ファイル目録.docx
+++ b/ファイル目録.docx
@@ -57,7 +57,7 @@
         <w:rPr>
           <w:rFonts w:hint="eastAsia"/>
         </w:rPr>
-        <w:t>disaster_sup</w:t>
+        <w:t>my_fastapi_app_main</w:t>
       </w:r>
       <w:r>
         <w:t xml:space="preserve">　ディレクトリ構成</w:t>
@@ -76,7 +76,7 @@
         <w:rPr>
           <w:rFonts w:hint="eastAsia"/>
         </w:rPr>
-        <w:t>disaster_sup</w:t>
+        <w:t>my_fastapi_app_main</w:t>
       </w:r>
       <w:r>
         <w:br/>
@@ -164,11 +164,6 @@
       </w:r>
     </w:p>
     <w:p>
-      <w:pPr>
-        <w:rPr>
-          <w:rFonts w:hint="eastAsia"/>
-        </w:rPr>
-      </w:pPr>
       <w:r>
         <w:t xml:space="preserve">    ├── </w:t>
       </w:r>
@@ -397,11 +392,6 @@
       </w:r>
     </w:p>
     <w:p>
-      <w:pPr>
-        <w:rPr>
-          <w:rFonts w:hint="eastAsia"/>
-        </w:rPr>
-      </w:pPr>
       <w:r>
         <w:t>    └──</w:t>
       </w:r>
@@ -1114,6 +1104,7 @@
   <w:style w:type="character" w:default="1" w:styleId="a0">
     <w:name w:val="Default Paragraph Font"/>
     <w:uiPriority w:val="1"/>
+    <w:semiHidden/>
     <w:unhideWhenUsed/>
   </w:style>
   <w:style w:type="table" w:default="1" w:styleId="a1">

</xml_diff>